<commit_message>
Actualizar solicitudes de dominio UCO, corregir area de Carmen Barbero y actualizar perfil y foto de Luz Marina Caracuel
</commit_message>
<xml_diff>
--- a/solicitud_base_datos.docx
+++ b/solicitud_base_datos.docx
@@ -488,6 +488,14 @@
               </w:rPr>
               <w:t xml:space="preserve">: </w:t>
             </w:r>
+            <w:r>
+              <w:rPr>
+                <w:rFonts w:ascii="Arial" w:hAnsi="Arial"/>
+                <w:b w:val="0"/>
+                <w:i w:val="0"/>
+              </w:rPr>
+              <w:t>Ricardo David Hernández Rojas</w:t>
+            </w:r>
           </w:p>
           <w:p>
             <w:pPr>

</xml_diff>